<commit_message>
Remove temporary document and update guest list styles in PDF and Word utilities
</commit_message>
<xml_diff>
--- a/assets/contracts/default-guest-list-template.docx
+++ b/assets/contracts/default-guest-list-template.docx
@@ -4,8 +4,8 @@
   <w:body>
     <w:p>
       <w:pPr>
+        <w:spacing w:after="60" w:line="340" w:lineRule="auto"/>
         <w:jc w:val="center"/>
-        <w:spacing w:before="0" w:after="60" w:line="340" w:lineRule="auto"/>
       </w:pPr>
       <w:r>
         <w:rPr>
@@ -13,21 +13,21 @@
           <w:sz w:val="40"/>
           <w:lang w:val="es-CO"/>
         </w:rPr>
-        <w:t xml:space="preserve">LISTA DE INVITADOS — CHECK-IN</w:t>
+        <w:t>LISTA DE INVITADOS — CHECK-IN</w:t>
       </w:r>
     </w:p>
     <w:p>
       <w:pPr>
+        <w:spacing w:after="100" w:line="300" w:lineRule="auto"/>
         <w:jc w:val="center"/>
-        <w:spacing w:before="0" w:after="100" w:line="300" w:lineRule="auto"/>
       </w:pPr>
       <w:r>
         <w:rPr>
+          <w:color w:val="666666"/>
           <w:sz w:val="26"/>
-          <w:color w:val="666666"/>
           <w:lang w:val="es-CO"/>
         </w:rPr>
-        <w:t xml:space="preserve">Documento generado por Fincas Ya para el propietario</w:t>
+        <w:t>Documento generado por Fincas Ya para el propietario</w:t>
       </w:r>
     </w:p>
     <w:p>
@@ -35,10 +35,41 @@
         <w:t>{{contenido}}</w:t>
       </w:r>
     </w:p>
+    <w:p/>
+    <w:p/>
+    <w:p/>
+    <w:p>
+      <w:pPr>
+        <w:tabs>
+          <w:tab w:val="left" w:pos="7832"/>
+        </w:tabs>
+      </w:pPr>
+      <w:r>
+        <w:tab/>
+      </w:r>
+    </w:p>
+    <w:p/>
+    <w:p/>
+    <w:p/>
+    <w:p/>
+    <w:p/>
+    <w:p>
+      <w:pPr>
+        <w:tabs>
+          <w:tab w:val="left" w:pos="5912"/>
+        </w:tabs>
+      </w:pPr>
+      <w:r>
+        <w:tab/>
+      </w:r>
+    </w:p>
     <w:sectPr>
       <w:headerReference w:type="even" r:id="rId7"/>
       <w:headerReference w:type="default" r:id="rId8"/>
-      <w:headerReference w:type="first" r:id="rId9"/>
+      <w:footerReference w:type="even" r:id="rId9"/>
+      <w:footerReference w:type="default" r:id="rId10"/>
+      <w:headerReference w:type="first" r:id="rId11"/>
+      <w:footerReference w:type="first" r:id="rId12"/>
       <w:pgSz w:w="12240" w:h="15840"/>
       <w:pgMar w:top="720" w:right="1080" w:bottom="720" w:left="1080" w:header="480" w:footer="360" w:gutter="0"/>
       <w:cols w:space="708"/>
@@ -73,6 +104,36 @@
 </w:endnotes>
 </file>
 
+<file path=word/footer1.xml><?xml version="1.0" encoding="utf-8"?>
+<w:ftr xmlns:wpc="http://schemas.microsoft.com/office/word/2010/wordprocessingCanvas" xmlns:cx="http://schemas.microsoft.com/office/drawing/2014/chartex" xmlns:cx1="http://schemas.microsoft.com/office/drawing/2015/9/8/chartex" xmlns:cx2="http://schemas.microsoft.com/office/drawing/2015/10/21/chartex" xmlns:cx3="http://schemas.microsoft.com/office/drawing/2016/5/9/chartex" xmlns:cx4="http://schemas.microsoft.com/office/drawing/2016/5/10/chartex" xmlns:cx5="http://schemas.microsoft.com/office/drawing/2016/5/11/chartex" xmlns:cx6="http://schemas.microsoft.com/office/drawing/2016/5/12/chartex" xmlns:cx7="http://schemas.microsoft.com/office/drawing/2016/5/13/chartex" xmlns:cx8="http://schemas.microsoft.com/office/drawing/2016/5/14/chartex" xmlns:mc="http://schemas.openxmlformats.org/markup-compatibility/2006" xmlns:m="http://schemas.openxmlformats.org/officeDocument/2006/math" xmlns:aink="http://schemas.microsoft.com/office/drawing/2016/ink" xmlns:am3d="http://schemas.microsoft.com/office/drawing/2017/model3d" xmlns:oel="http://schemas.microsoft.com/office/2019/extlst" xmlns:r="http://schemas.openxmlformats.org/officeDocument/2006/relationships" xmlns:wp14="http://schemas.microsoft.com/office/word/2010/wordprocessingDrawing" xmlns:wp="http://schemas.openxmlformats.org/drawingml/2006/wordprocessingDrawing" xmlns:wpg="http://schemas.microsoft.com/office/word/2010/wordprocessingGroup" xmlns:wpi="http://schemas.microsoft.com/office/word/2010/wordprocessingInk" xmlns:wps="http://schemas.microsoft.com/office/word/2010/wordprocessingShape" xmlns:o="urn:schemas-microsoft-com:office:office" xmlns:v="urn:schemas-microsoft-com:vml" xmlns:w10="urn:schemas-microsoft-com:office:word" xmlns:w="http://schemas.openxmlformats.org/wordprocessingml/2006/main" xmlns:w14="http://schemas.microsoft.com/office/word/2010/wordml" xmlns:w15="http://schemas.microsoft.com/office/word/2012/wordml" xmlns:w16cex="http://schemas.microsoft.com/office/word/2018/wordml/cex" xmlns:w16cid="http://schemas.microsoft.com/office/word/2016/wordml/cid" xmlns:w16="http://schemas.microsoft.com/office/word/2018/wordml" xmlns:w16sdtdh="http://schemas.microsoft.com/office/word/2020/wordml/sdtdatahash" xmlns:w16sdtfl="http://schemas.microsoft.com/office/word/2024/wordml/sdtformatlock" xmlns:w16se="http://schemas.microsoft.com/office/word/2015/wordml/symex" xmlns:w16du="http://schemas.microsoft.com/office/word/2023/wordml/word16du" xmlns:wne="http://schemas.microsoft.com/office/word/2006/wordml" mc:Ignorable="w14 w15 w16se w16cid w16 w16cex w16sdtdh w16sdtfl w16du wp14">
+  <w:p>
+    <w:pPr>
+      <w:pStyle w:val="Footer"/>
+    </w:pPr>
+  </w:p>
+</w:ftr>
+</file>
+
+<file path=word/footer2.xml><?xml version="1.0" encoding="utf-8"?>
+<w:ftr xmlns:wpc="http://schemas.microsoft.com/office/word/2010/wordprocessingCanvas" xmlns:cx="http://schemas.microsoft.com/office/drawing/2014/chartex" xmlns:cx1="http://schemas.microsoft.com/office/drawing/2015/9/8/chartex" xmlns:cx2="http://schemas.microsoft.com/office/drawing/2015/10/21/chartex" xmlns:cx3="http://schemas.microsoft.com/office/drawing/2016/5/9/chartex" xmlns:cx4="http://schemas.microsoft.com/office/drawing/2016/5/10/chartex" xmlns:cx5="http://schemas.microsoft.com/office/drawing/2016/5/11/chartex" xmlns:cx6="http://schemas.microsoft.com/office/drawing/2016/5/12/chartex" xmlns:cx7="http://schemas.microsoft.com/office/drawing/2016/5/13/chartex" xmlns:cx8="http://schemas.microsoft.com/office/drawing/2016/5/14/chartex" xmlns:mc="http://schemas.openxmlformats.org/markup-compatibility/2006" xmlns:m="http://schemas.openxmlformats.org/officeDocument/2006/math" xmlns:aink="http://schemas.microsoft.com/office/drawing/2016/ink" xmlns:am3d="http://schemas.microsoft.com/office/drawing/2017/model3d" xmlns:oel="http://schemas.microsoft.com/office/2019/extlst" xmlns:r="http://schemas.openxmlformats.org/officeDocument/2006/relationships" xmlns:wp14="http://schemas.microsoft.com/office/word/2010/wordprocessingDrawing" xmlns:wp="http://schemas.openxmlformats.org/drawingml/2006/wordprocessingDrawing" xmlns:wpg="http://schemas.microsoft.com/office/word/2010/wordprocessingGroup" xmlns:wpi="http://schemas.microsoft.com/office/word/2010/wordprocessingInk" xmlns:wps="http://schemas.microsoft.com/office/word/2010/wordprocessingShape" xmlns:o="urn:schemas-microsoft-com:office:office" xmlns:v="urn:schemas-microsoft-com:vml" xmlns:w10="urn:schemas-microsoft-com:office:word" xmlns:w="http://schemas.openxmlformats.org/wordprocessingml/2006/main" xmlns:w14="http://schemas.microsoft.com/office/word/2010/wordml" xmlns:w15="http://schemas.microsoft.com/office/word/2012/wordml" xmlns:w16cex="http://schemas.microsoft.com/office/word/2018/wordml/cex" xmlns:w16cid="http://schemas.microsoft.com/office/word/2016/wordml/cid" xmlns:w16="http://schemas.microsoft.com/office/word/2018/wordml" xmlns:w16sdtdh="http://schemas.microsoft.com/office/word/2020/wordml/sdtdatahash" xmlns:w16sdtfl="http://schemas.microsoft.com/office/word/2024/wordml/sdtformatlock" xmlns:w16se="http://schemas.microsoft.com/office/word/2015/wordml/symex" xmlns:w16du="http://schemas.microsoft.com/office/word/2023/wordml/word16du" xmlns:wne="http://schemas.microsoft.com/office/word/2006/wordml" mc:Ignorable="w14 w15 w16se w16cid w16 w16cex w16sdtdh w16sdtfl w16du wp14">
+  <w:p>
+    <w:pPr>
+      <w:pStyle w:val="Footer"/>
+    </w:pPr>
+  </w:p>
+</w:ftr>
+</file>
+
+<file path=word/footer3.xml><?xml version="1.0" encoding="utf-8"?>
+<w:ftr xmlns:wpc="http://schemas.microsoft.com/office/word/2010/wordprocessingCanvas" xmlns:cx="http://schemas.microsoft.com/office/drawing/2014/chartex" xmlns:cx1="http://schemas.microsoft.com/office/drawing/2015/9/8/chartex" xmlns:cx2="http://schemas.microsoft.com/office/drawing/2015/10/21/chartex" xmlns:cx3="http://schemas.microsoft.com/office/drawing/2016/5/9/chartex" xmlns:cx4="http://schemas.microsoft.com/office/drawing/2016/5/10/chartex" xmlns:cx5="http://schemas.microsoft.com/office/drawing/2016/5/11/chartex" xmlns:cx6="http://schemas.microsoft.com/office/drawing/2016/5/12/chartex" xmlns:cx7="http://schemas.microsoft.com/office/drawing/2016/5/13/chartex" xmlns:cx8="http://schemas.microsoft.com/office/drawing/2016/5/14/chartex" xmlns:mc="http://schemas.openxmlformats.org/markup-compatibility/2006" xmlns:m="http://schemas.openxmlformats.org/officeDocument/2006/math" xmlns:aink="http://schemas.microsoft.com/office/drawing/2016/ink" xmlns:am3d="http://schemas.microsoft.com/office/drawing/2017/model3d" xmlns:oel="http://schemas.microsoft.com/office/2019/extlst" xmlns:r="http://schemas.openxmlformats.org/officeDocument/2006/relationships" xmlns:wp14="http://schemas.microsoft.com/office/word/2010/wordprocessingDrawing" xmlns:wp="http://schemas.openxmlformats.org/drawingml/2006/wordprocessingDrawing" xmlns:wpg="http://schemas.microsoft.com/office/word/2010/wordprocessingGroup" xmlns:wpi="http://schemas.microsoft.com/office/word/2010/wordprocessingInk" xmlns:wps="http://schemas.microsoft.com/office/word/2010/wordprocessingShape" xmlns:o="urn:schemas-microsoft-com:office:office" xmlns:v="urn:schemas-microsoft-com:vml" xmlns:w10="urn:schemas-microsoft-com:office:word" xmlns:w="http://schemas.openxmlformats.org/wordprocessingml/2006/main" xmlns:w14="http://schemas.microsoft.com/office/word/2010/wordml" xmlns:w15="http://schemas.microsoft.com/office/word/2012/wordml" xmlns:w16cex="http://schemas.microsoft.com/office/word/2018/wordml/cex" xmlns:w16cid="http://schemas.microsoft.com/office/word/2016/wordml/cid" xmlns:w16="http://schemas.microsoft.com/office/word/2018/wordml" xmlns:w16sdtdh="http://schemas.microsoft.com/office/word/2020/wordml/sdtdatahash" xmlns:w16sdtfl="http://schemas.microsoft.com/office/word/2024/wordml/sdtformatlock" xmlns:w16se="http://schemas.microsoft.com/office/word/2015/wordml/symex" xmlns:w16du="http://schemas.microsoft.com/office/word/2023/wordml/word16du" xmlns:wne="http://schemas.microsoft.com/office/word/2006/wordml" mc:Ignorable="w14 w15 w16se w16cid w16 w16cex w16sdtdh w16sdtfl w16du wp14">
+  <w:p>
+    <w:pPr>
+      <w:pStyle w:val="Footer"/>
+    </w:pPr>
+  </w:p>
+</w:ftr>
+</file>
+
 <file path=word/footnotes.xml><?xml version="1.0" encoding="utf-8"?>
 <w:footnotes xmlns:wpc="http://schemas.microsoft.com/office/word/2010/wordprocessingCanvas" xmlns:cx="http://schemas.microsoft.com/office/drawing/2014/chartex" xmlns:cx1="http://schemas.microsoft.com/office/drawing/2015/9/8/chartex" xmlns:cx2="http://schemas.microsoft.com/office/drawing/2015/10/21/chartex" xmlns:cx3="http://schemas.microsoft.com/office/drawing/2016/5/9/chartex" xmlns:cx4="http://schemas.microsoft.com/office/drawing/2016/5/10/chartex" xmlns:cx5="http://schemas.microsoft.com/office/drawing/2016/5/11/chartex" xmlns:cx6="http://schemas.microsoft.com/office/drawing/2016/5/12/chartex" xmlns:cx7="http://schemas.microsoft.com/office/drawing/2016/5/13/chartex" xmlns:cx8="http://schemas.microsoft.com/office/drawing/2016/5/14/chartex" xmlns:mc="http://schemas.openxmlformats.org/markup-compatibility/2006" xmlns:m="http://schemas.openxmlformats.org/officeDocument/2006/math" xmlns:aink="http://schemas.microsoft.com/office/drawing/2016/ink" xmlns:am3d="http://schemas.microsoft.com/office/drawing/2017/model3d" xmlns:oel="http://schemas.microsoft.com/office/2019/extlst" xmlns:r="http://schemas.openxmlformats.org/officeDocument/2006/relationships" xmlns:wp14="http://schemas.microsoft.com/office/word/2010/wordprocessingDrawing" xmlns:wp="http://schemas.openxmlformats.org/drawingml/2006/wordprocessingDrawing" xmlns:wpg="http://schemas.microsoft.com/office/word/2010/wordprocessingGroup" xmlns:wpi="http://schemas.microsoft.com/office/word/2010/wordprocessingInk" xmlns:wps="http://schemas.microsoft.com/office/word/2010/wordprocessingShape" xmlns:o="urn:schemas-microsoft-com:office:office" xmlns:v="urn:schemas-microsoft-com:vml" xmlns:w10="urn:schemas-microsoft-com:office:word" xmlns:w="http://schemas.openxmlformats.org/wordprocessingml/2006/main" xmlns:w14="http://schemas.microsoft.com/office/word/2010/wordml" xmlns:w15="http://schemas.microsoft.com/office/word/2012/wordml" xmlns:w16cex="http://schemas.microsoft.com/office/word/2018/wordml/cex" xmlns:w16cid="http://schemas.microsoft.com/office/word/2016/wordml/cid" xmlns:w16="http://schemas.microsoft.com/office/word/2018/wordml" xmlns:w16sdtdh="http://schemas.microsoft.com/office/word/2020/wordml/sdtdatahash" xmlns:w16sdtfl="http://schemas.microsoft.com/office/word/2024/wordml/sdtformatlock" xmlns:w16se="http://schemas.microsoft.com/office/word/2015/wordml/symex" xmlns:w16du="http://schemas.microsoft.com/office/word/2023/wordml/word16du" xmlns:wne="http://schemas.microsoft.com/office/word/2006/wordml" mc:Ignorable="w14 w15 w16se w16cid w16 w16cex w16sdtdh w16sdtfl w16du wp14">
   <w:footnote w:type="separator" w:id="-1">
@@ -108,7 +169,7 @@
       <w:rPr>
         <w:noProof/>
       </w:rPr>
-      <w:pict w14:anchorId="11768E0B">
+      <w:pict w14:anchorId="7D4A4E10">
         <v:shapetype id="_x0000_t75" coordsize="21600,21600" o:spt="75" o:preferrelative="t" path="m@4@5l@4@11@9@11@9@5xe" filled="f" stroked="f">
           <v:stroke joinstyle="miter"/>
           <v:formulas>
@@ -128,9 +189,8 @@
           <v:path o:extrusionok="f" gradientshapeok="t" o:connecttype="rect"/>
           <o:lock v:ext="edit" aspectratio="t"/>
         </v:shapetype>
-        <v:shape id="WordPictureWatermark1059219811" o:spid="_x0000_s1027" type="#_x0000_t75" alt="" style="position:absolute;margin-left:0;margin-top:0;width:468pt;height:468pt;z-index:-251653120;mso-wrap-edited:f;mso-width-percent:0;mso-height-percent:0;mso-position-horizontal:center;mso-position-horizontal-relative:margin;mso-position-vertical:center;mso-position-vertical-relative:margin;mso-width-percent:0;mso-height-percent:0" o:allowincell="f">
-          <v:imagedata r:id="rId1" o:title="S" gain="19661f" blacklevel="22938f"/>
-          <w10:wrap anchorx="margin" anchory="margin"/>
+        <v:shape id="WordPictureWatermark1375570289" o:spid="_x0000_s1027" type="#_x0000_t75" alt="" style="position:absolute;margin-left:0;margin-top:0;width:469pt;height:263pt;z-index:-251639808;mso-wrap-edited:f;mso-width-percent:0;mso-height-percent:0;mso-position-horizontal:center;mso-position-horizontal-relative:margin;mso-position-vertical:center;mso-position-vertical-relative:margin;mso-width-percent:0;mso-height-percent:0" o:allowincell="f">
+          <v:imagedata r:id="rId1" o:title="Picture1" gain="19661f" blacklevel="22938f"/>
         </v:shape>
       </w:pict>
     </w:r>
@@ -149,7 +209,7 @@
       <w:rPr>
         <w:noProof/>
       </w:rPr>
-      <w:pict w14:anchorId="2F676AB3">
+      <w:pict w14:anchorId="498244EB">
         <v:shapetype id="_x0000_t75" coordsize="21600,21600" o:spt="75" o:preferrelative="t" path="m@4@5l@4@11@9@11@9@5xe" filled="f" stroked="f">
           <v:stroke joinstyle="miter"/>
           <v:formulas>
@@ -169,9 +229,8 @@
           <v:path o:extrusionok="f" gradientshapeok="t" o:connecttype="rect"/>
           <o:lock v:ext="edit" aspectratio="t"/>
         </v:shapetype>
-        <v:shape id="WordPictureWatermark1059219812" o:spid="_x0000_s1026" type="#_x0000_t75" alt="" style="position:absolute;left:0;text-align:left;margin-left:0;margin-top:0;width:468pt;height:468pt;z-index:-251650048;mso-wrap-edited:f;mso-width-percent:0;mso-height-percent:0;mso-position-horizontal:center;mso-position-horizontal-relative:margin;mso-position-vertical:center;mso-position-vertical-relative:margin;mso-width-percent:0;mso-height-percent:0" o:allowincell="f">
-          <v:imagedata r:id="rId1" o:title="S" gain="19661f" blacklevel="22938f"/>
-          <w10:wrap anchorx="margin" anchory="margin"/>
+        <v:shape id="WordPictureWatermark1375570290" o:spid="_x0000_s1026" type="#_x0000_t75" alt="" style="position:absolute;left:0;text-align:left;margin-left:0;margin-top:0;width:469pt;height:263pt;z-index:-251637760;mso-wrap-edited:f;mso-width-percent:0;mso-height-percent:0;mso-position-horizontal:center;mso-position-horizontal-relative:margin;mso-position-vertical:center;mso-position-vertical-relative:margin;mso-width-percent:0;mso-height-percent:0" o:allowincell="f">
+          <v:imagedata r:id="rId1" o:title="Picture1" gain="19661f" blacklevel="22938f"/>
         </v:shape>
       </w:pict>
     </w:r>
@@ -235,7 +294,7 @@
       <w:rPr>
         <w:noProof/>
       </w:rPr>
-      <w:pict w14:anchorId="7B1FE56D">
+      <w:pict w14:anchorId="3F378FAC">
         <v:shapetype id="_x0000_t75" coordsize="21600,21600" o:spt="75" o:preferrelative="t" path="m@4@5l@4@11@9@11@9@5xe" filled="f" stroked="f">
           <v:stroke joinstyle="miter"/>
           <v:formulas>
@@ -255,9 +314,8 @@
           <v:path o:extrusionok="f" gradientshapeok="t" o:connecttype="rect"/>
           <o:lock v:ext="edit" aspectratio="t"/>
         </v:shapetype>
-        <v:shape id="WordPictureWatermark1059219810" o:spid="_x0000_s1025" type="#_x0000_t75" alt="" style="position:absolute;margin-left:0;margin-top:0;width:468pt;height:468pt;z-index:-251656192;mso-wrap-edited:f;mso-width-percent:0;mso-height-percent:0;mso-position-horizontal:center;mso-position-horizontal-relative:margin;mso-position-vertical:center;mso-position-vertical-relative:margin;mso-width-percent:0;mso-height-percent:0" o:allowincell="f">
-          <v:imagedata r:id="rId1" o:title="S" gain="19661f" blacklevel="22938f"/>
-          <w10:wrap anchorx="margin" anchory="margin"/>
+        <v:shape id="WordPictureWatermark1375570288" o:spid="_x0000_s1025" type="#_x0000_t75" alt="" style="position:absolute;margin-left:0;margin-top:0;width:469pt;height:263pt;z-index:-251641856;mso-wrap-edited:f;mso-width-percent:0;mso-height-percent:0;mso-position-horizontal:center;mso-position-horizontal-relative:margin;mso-position-vertical:center;mso-position-vertical-relative:margin;mso-width-percent:0;mso-height-percent:0" o:allowincell="f">
+          <v:imagedata r:id="rId1" o:title="Picture1" gain="19661f" blacklevel="22938f"/>
         </v:shape>
       </w:pict>
     </w:r>

</xml_diff>

<commit_message>
Refactor guest list template handling by removing unused document references and optimizing XML processing. Update guest list PDF service to streamline watermark handling and improve template processing logic.
</commit_message>
<xml_diff>
--- a/assets/contracts/default-guest-list-template.docx
+++ b/assets/contracts/default-guest-list-template.docx
@@ -4,8 +4,8 @@
   <w:body>
     <w:p>
       <w:pPr>
-        <w:spacing w:after="60" w:line="340" w:lineRule="auto"/>
         <w:jc w:val="center"/>
+        <w:spacing w:before="0" w:after="60" w:line="340" w:lineRule="auto"/>
       </w:pPr>
       <w:r>
         <w:rPr>
@@ -13,21 +13,21 @@
           <w:sz w:val="40"/>
           <w:lang w:val="es-CO"/>
         </w:rPr>
-        <w:t>LISTA DE INVITADOS — CHECK-IN</w:t>
+        <w:t xml:space="preserve">LISTA DE INVITADOS — CHECK-IN</w:t>
       </w:r>
     </w:p>
     <w:p>
       <w:pPr>
-        <w:spacing w:after="100" w:line="300" w:lineRule="auto"/>
         <w:jc w:val="center"/>
+        <w:spacing w:before="0" w:after="100" w:line="300" w:lineRule="auto"/>
       </w:pPr>
       <w:r>
         <w:rPr>
+          <w:sz w:val="26"/>
           <w:color w:val="666666"/>
-          <w:sz w:val="26"/>
           <w:lang w:val="es-CO"/>
         </w:rPr>
-        <w:t>Documento generado por Fincas Ya para el propietario</w:t>
+        <w:t xml:space="preserve">Documento generado por Fincas Ya para el propietario</w:t>
       </w:r>
     </w:p>
     <w:p>
@@ -35,41 +35,10 @@
         <w:t>{{contenido}}</w:t>
       </w:r>
     </w:p>
-    <w:p/>
-    <w:p/>
-    <w:p/>
-    <w:p>
-      <w:pPr>
-        <w:tabs>
-          <w:tab w:val="left" w:pos="7832"/>
-        </w:tabs>
-      </w:pPr>
-      <w:r>
-        <w:tab/>
-      </w:r>
-    </w:p>
-    <w:p/>
-    <w:p/>
-    <w:p/>
-    <w:p/>
-    <w:p/>
-    <w:p>
-      <w:pPr>
-        <w:tabs>
-          <w:tab w:val="left" w:pos="5912"/>
-        </w:tabs>
-      </w:pPr>
-      <w:r>
-        <w:tab/>
-      </w:r>
-    </w:p>
     <w:sectPr>
       <w:headerReference w:type="even" r:id="rId7"/>
       <w:headerReference w:type="default" r:id="rId8"/>
-      <w:footerReference w:type="even" r:id="rId9"/>
-      <w:footerReference w:type="default" r:id="rId10"/>
-      <w:headerReference w:type="first" r:id="rId11"/>
-      <w:footerReference w:type="first" r:id="rId12"/>
+      <w:headerReference w:type="first" r:id="rId9"/>
       <w:pgSz w:w="12240" w:h="15840"/>
       <w:pgMar w:top="720" w:right="1080" w:bottom="720" w:left="1080" w:header="480" w:footer="360" w:gutter="0"/>
       <w:cols w:space="708"/>
@@ -104,36 +73,6 @@
 </w:endnotes>
 </file>
 
-<file path=word/footer1.xml><?xml version="1.0" encoding="utf-8"?>
-<w:ftr xmlns:wpc="http://schemas.microsoft.com/office/word/2010/wordprocessingCanvas" xmlns:cx="http://schemas.microsoft.com/office/drawing/2014/chartex" xmlns:cx1="http://schemas.microsoft.com/office/drawing/2015/9/8/chartex" xmlns:cx2="http://schemas.microsoft.com/office/drawing/2015/10/21/chartex" xmlns:cx3="http://schemas.microsoft.com/office/drawing/2016/5/9/chartex" xmlns:cx4="http://schemas.microsoft.com/office/drawing/2016/5/10/chartex" xmlns:cx5="http://schemas.microsoft.com/office/drawing/2016/5/11/chartex" xmlns:cx6="http://schemas.microsoft.com/office/drawing/2016/5/12/chartex" xmlns:cx7="http://schemas.microsoft.com/office/drawing/2016/5/13/chartex" xmlns:cx8="http://schemas.microsoft.com/office/drawing/2016/5/14/chartex" xmlns:mc="http://schemas.openxmlformats.org/markup-compatibility/2006" xmlns:m="http://schemas.openxmlformats.org/officeDocument/2006/math" xmlns:aink="http://schemas.microsoft.com/office/drawing/2016/ink" xmlns:am3d="http://schemas.microsoft.com/office/drawing/2017/model3d" xmlns:oel="http://schemas.microsoft.com/office/2019/extlst" xmlns:r="http://schemas.openxmlformats.org/officeDocument/2006/relationships" xmlns:wp14="http://schemas.microsoft.com/office/word/2010/wordprocessingDrawing" xmlns:wp="http://schemas.openxmlformats.org/drawingml/2006/wordprocessingDrawing" xmlns:wpg="http://schemas.microsoft.com/office/word/2010/wordprocessingGroup" xmlns:wpi="http://schemas.microsoft.com/office/word/2010/wordprocessingInk" xmlns:wps="http://schemas.microsoft.com/office/word/2010/wordprocessingShape" xmlns:o="urn:schemas-microsoft-com:office:office" xmlns:v="urn:schemas-microsoft-com:vml" xmlns:w10="urn:schemas-microsoft-com:office:word" xmlns:w="http://schemas.openxmlformats.org/wordprocessingml/2006/main" xmlns:w14="http://schemas.microsoft.com/office/word/2010/wordml" xmlns:w15="http://schemas.microsoft.com/office/word/2012/wordml" xmlns:w16cex="http://schemas.microsoft.com/office/word/2018/wordml/cex" xmlns:w16cid="http://schemas.microsoft.com/office/word/2016/wordml/cid" xmlns:w16="http://schemas.microsoft.com/office/word/2018/wordml" xmlns:w16sdtdh="http://schemas.microsoft.com/office/word/2020/wordml/sdtdatahash" xmlns:w16sdtfl="http://schemas.microsoft.com/office/word/2024/wordml/sdtformatlock" xmlns:w16se="http://schemas.microsoft.com/office/word/2015/wordml/symex" xmlns:w16du="http://schemas.microsoft.com/office/word/2023/wordml/word16du" xmlns:wne="http://schemas.microsoft.com/office/word/2006/wordml" mc:Ignorable="w14 w15 w16se w16cid w16 w16cex w16sdtdh w16sdtfl w16du wp14">
-  <w:p>
-    <w:pPr>
-      <w:pStyle w:val="Footer"/>
-    </w:pPr>
-  </w:p>
-</w:ftr>
-</file>
-
-<file path=word/footer2.xml><?xml version="1.0" encoding="utf-8"?>
-<w:ftr xmlns:wpc="http://schemas.microsoft.com/office/word/2010/wordprocessingCanvas" xmlns:cx="http://schemas.microsoft.com/office/drawing/2014/chartex" xmlns:cx1="http://schemas.microsoft.com/office/drawing/2015/9/8/chartex" xmlns:cx2="http://schemas.microsoft.com/office/drawing/2015/10/21/chartex" xmlns:cx3="http://schemas.microsoft.com/office/drawing/2016/5/9/chartex" xmlns:cx4="http://schemas.microsoft.com/office/drawing/2016/5/10/chartex" xmlns:cx5="http://schemas.microsoft.com/office/drawing/2016/5/11/chartex" xmlns:cx6="http://schemas.microsoft.com/office/drawing/2016/5/12/chartex" xmlns:cx7="http://schemas.microsoft.com/office/drawing/2016/5/13/chartex" xmlns:cx8="http://schemas.microsoft.com/office/drawing/2016/5/14/chartex" xmlns:mc="http://schemas.openxmlformats.org/markup-compatibility/2006" xmlns:m="http://schemas.openxmlformats.org/officeDocument/2006/math" xmlns:aink="http://schemas.microsoft.com/office/drawing/2016/ink" xmlns:am3d="http://schemas.microsoft.com/office/drawing/2017/model3d" xmlns:oel="http://schemas.microsoft.com/office/2019/extlst" xmlns:r="http://schemas.openxmlformats.org/officeDocument/2006/relationships" xmlns:wp14="http://schemas.microsoft.com/office/word/2010/wordprocessingDrawing" xmlns:wp="http://schemas.openxmlformats.org/drawingml/2006/wordprocessingDrawing" xmlns:wpg="http://schemas.microsoft.com/office/word/2010/wordprocessingGroup" xmlns:wpi="http://schemas.microsoft.com/office/word/2010/wordprocessingInk" xmlns:wps="http://schemas.microsoft.com/office/word/2010/wordprocessingShape" xmlns:o="urn:schemas-microsoft-com:office:office" xmlns:v="urn:schemas-microsoft-com:vml" xmlns:w10="urn:schemas-microsoft-com:office:word" xmlns:w="http://schemas.openxmlformats.org/wordprocessingml/2006/main" xmlns:w14="http://schemas.microsoft.com/office/word/2010/wordml" xmlns:w15="http://schemas.microsoft.com/office/word/2012/wordml" xmlns:w16cex="http://schemas.microsoft.com/office/word/2018/wordml/cex" xmlns:w16cid="http://schemas.microsoft.com/office/word/2016/wordml/cid" xmlns:w16="http://schemas.microsoft.com/office/word/2018/wordml" xmlns:w16sdtdh="http://schemas.microsoft.com/office/word/2020/wordml/sdtdatahash" xmlns:w16sdtfl="http://schemas.microsoft.com/office/word/2024/wordml/sdtformatlock" xmlns:w16se="http://schemas.microsoft.com/office/word/2015/wordml/symex" xmlns:w16du="http://schemas.microsoft.com/office/word/2023/wordml/word16du" xmlns:wne="http://schemas.microsoft.com/office/word/2006/wordml" mc:Ignorable="w14 w15 w16se w16cid w16 w16cex w16sdtdh w16sdtfl w16du wp14">
-  <w:p>
-    <w:pPr>
-      <w:pStyle w:val="Footer"/>
-    </w:pPr>
-  </w:p>
-</w:ftr>
-</file>
-
-<file path=word/footer3.xml><?xml version="1.0" encoding="utf-8"?>
-<w:ftr xmlns:wpc="http://schemas.microsoft.com/office/word/2010/wordprocessingCanvas" xmlns:cx="http://schemas.microsoft.com/office/drawing/2014/chartex" xmlns:cx1="http://schemas.microsoft.com/office/drawing/2015/9/8/chartex" xmlns:cx2="http://schemas.microsoft.com/office/drawing/2015/10/21/chartex" xmlns:cx3="http://schemas.microsoft.com/office/drawing/2016/5/9/chartex" xmlns:cx4="http://schemas.microsoft.com/office/drawing/2016/5/10/chartex" xmlns:cx5="http://schemas.microsoft.com/office/drawing/2016/5/11/chartex" xmlns:cx6="http://schemas.microsoft.com/office/drawing/2016/5/12/chartex" xmlns:cx7="http://schemas.microsoft.com/office/drawing/2016/5/13/chartex" xmlns:cx8="http://schemas.microsoft.com/office/drawing/2016/5/14/chartex" xmlns:mc="http://schemas.openxmlformats.org/markup-compatibility/2006" xmlns:m="http://schemas.openxmlformats.org/officeDocument/2006/math" xmlns:aink="http://schemas.microsoft.com/office/drawing/2016/ink" xmlns:am3d="http://schemas.microsoft.com/office/drawing/2017/model3d" xmlns:oel="http://schemas.microsoft.com/office/2019/extlst" xmlns:r="http://schemas.openxmlformats.org/officeDocument/2006/relationships" xmlns:wp14="http://schemas.microsoft.com/office/word/2010/wordprocessingDrawing" xmlns:wp="http://schemas.openxmlformats.org/drawingml/2006/wordprocessingDrawing" xmlns:wpg="http://schemas.microsoft.com/office/word/2010/wordprocessingGroup" xmlns:wpi="http://schemas.microsoft.com/office/word/2010/wordprocessingInk" xmlns:wps="http://schemas.microsoft.com/office/word/2010/wordprocessingShape" xmlns:o="urn:schemas-microsoft-com:office:office" xmlns:v="urn:schemas-microsoft-com:vml" xmlns:w10="urn:schemas-microsoft-com:office:word" xmlns:w="http://schemas.openxmlformats.org/wordprocessingml/2006/main" xmlns:w14="http://schemas.microsoft.com/office/word/2010/wordml" xmlns:w15="http://schemas.microsoft.com/office/word/2012/wordml" xmlns:w16cex="http://schemas.microsoft.com/office/word/2018/wordml/cex" xmlns:w16cid="http://schemas.microsoft.com/office/word/2016/wordml/cid" xmlns:w16="http://schemas.microsoft.com/office/word/2018/wordml" xmlns:w16sdtdh="http://schemas.microsoft.com/office/word/2020/wordml/sdtdatahash" xmlns:w16sdtfl="http://schemas.microsoft.com/office/word/2024/wordml/sdtformatlock" xmlns:w16se="http://schemas.microsoft.com/office/word/2015/wordml/symex" xmlns:w16du="http://schemas.microsoft.com/office/word/2023/wordml/word16du" xmlns:wne="http://schemas.microsoft.com/office/word/2006/wordml" mc:Ignorable="w14 w15 w16se w16cid w16 w16cex w16sdtdh w16sdtfl w16du wp14">
-  <w:p>
-    <w:pPr>
-      <w:pStyle w:val="Footer"/>
-    </w:pPr>
-  </w:p>
-</w:ftr>
-</file>
-
 <file path=word/footnotes.xml><?xml version="1.0" encoding="utf-8"?>
 <w:footnotes xmlns:wpc="http://schemas.microsoft.com/office/word/2010/wordprocessingCanvas" xmlns:cx="http://schemas.microsoft.com/office/drawing/2014/chartex" xmlns:cx1="http://schemas.microsoft.com/office/drawing/2015/9/8/chartex" xmlns:cx2="http://schemas.microsoft.com/office/drawing/2015/10/21/chartex" xmlns:cx3="http://schemas.microsoft.com/office/drawing/2016/5/9/chartex" xmlns:cx4="http://schemas.microsoft.com/office/drawing/2016/5/10/chartex" xmlns:cx5="http://schemas.microsoft.com/office/drawing/2016/5/11/chartex" xmlns:cx6="http://schemas.microsoft.com/office/drawing/2016/5/12/chartex" xmlns:cx7="http://schemas.microsoft.com/office/drawing/2016/5/13/chartex" xmlns:cx8="http://schemas.microsoft.com/office/drawing/2016/5/14/chartex" xmlns:mc="http://schemas.openxmlformats.org/markup-compatibility/2006" xmlns:m="http://schemas.openxmlformats.org/officeDocument/2006/math" xmlns:aink="http://schemas.microsoft.com/office/drawing/2016/ink" xmlns:am3d="http://schemas.microsoft.com/office/drawing/2017/model3d" xmlns:oel="http://schemas.microsoft.com/office/2019/extlst" xmlns:r="http://schemas.openxmlformats.org/officeDocument/2006/relationships" xmlns:wp14="http://schemas.microsoft.com/office/word/2010/wordprocessingDrawing" xmlns:wp="http://schemas.openxmlformats.org/drawingml/2006/wordprocessingDrawing" xmlns:wpg="http://schemas.microsoft.com/office/word/2010/wordprocessingGroup" xmlns:wpi="http://schemas.microsoft.com/office/word/2010/wordprocessingInk" xmlns:wps="http://schemas.microsoft.com/office/word/2010/wordprocessingShape" xmlns:o="urn:schemas-microsoft-com:office:office" xmlns:v="urn:schemas-microsoft-com:vml" xmlns:w10="urn:schemas-microsoft-com:office:word" xmlns:w="http://schemas.openxmlformats.org/wordprocessingml/2006/main" xmlns:w14="http://schemas.microsoft.com/office/word/2010/wordml" xmlns:w15="http://schemas.microsoft.com/office/word/2012/wordml" xmlns:w16cex="http://schemas.microsoft.com/office/word/2018/wordml/cex" xmlns:w16cid="http://schemas.microsoft.com/office/word/2016/wordml/cid" xmlns:w16="http://schemas.microsoft.com/office/word/2018/wordml" xmlns:w16sdtdh="http://schemas.microsoft.com/office/word/2020/wordml/sdtdatahash" xmlns:w16sdtfl="http://schemas.microsoft.com/office/word/2024/wordml/sdtformatlock" xmlns:w16se="http://schemas.microsoft.com/office/word/2015/wordml/symex" xmlns:w16du="http://schemas.microsoft.com/office/word/2023/wordml/word16du" xmlns:wne="http://schemas.microsoft.com/office/word/2006/wordml" mc:Ignorable="w14 w15 w16se w16cid w16 w16cex w16sdtdh w16sdtfl w16du wp14">
   <w:footnote w:type="separator" w:id="-1">
@@ -169,7 +108,7 @@
       <w:rPr>
         <w:noProof/>
       </w:rPr>
-      <w:pict w14:anchorId="7D4A4E10">
+      <w:pict w14:anchorId="76AE7B78">
         <v:shapetype id="_x0000_t75" coordsize="21600,21600" o:spt="75" o:preferrelative="t" path="m@4@5l@4@11@9@11@9@5xe" filled="f" stroked="f">
           <v:stroke joinstyle="miter"/>
           <v:formulas>
@@ -189,8 +128,9 @@
           <v:path o:extrusionok="f" gradientshapeok="t" o:connecttype="rect"/>
           <o:lock v:ext="edit" aspectratio="t"/>
         </v:shapetype>
-        <v:shape id="WordPictureWatermark1375570289" o:spid="_x0000_s1027" type="#_x0000_t75" alt="" style="position:absolute;margin-left:0;margin-top:0;width:469pt;height:263pt;z-index:-251639808;mso-wrap-edited:f;mso-width-percent:0;mso-height-percent:0;mso-position-horizontal:center;mso-position-horizontal-relative:margin;mso-position-vertical:center;mso-position-vertical-relative:margin;mso-width-percent:0;mso-height-percent:0" o:allowincell="f">
-          <v:imagedata r:id="rId1" o:title="Picture1" gain="19661f" blacklevel="22938f"/>
+        <v:shape id="WordPictureWatermark1062352011" o:spid="_x0000_s1027" type="#_x0000_t75" alt="" style="position:absolute;margin-left:0;margin-top:0;width:467.8pt;height:263.15pt;z-index:-251653120;mso-wrap-edited:f;mso-width-percent:0;mso-height-percent:0;mso-position-horizontal:center;mso-position-horizontal-relative:margin;mso-position-vertical:center;mso-position-vertical-relative:margin;mso-width-percent:0;mso-height-percent:0" o:allowincell="f">
+          <v:imagedata r:id="rId1" o:title="logo-dark" gain="19661f" blacklevel="22938f"/>
+          <w10:wrap anchorx="margin" anchory="margin"/>
         </v:shape>
       </w:pict>
     </w:r>
@@ -209,7 +149,53 @@
       <w:rPr>
         <w:noProof/>
       </w:rPr>
-      <w:pict w14:anchorId="498244EB">
+      <w:drawing>
+        <wp:inline distT="0" distB="0" distL="0" distR="0" wp14:anchorId="7E3FCA8E" wp14:editId="6375C540">
+          <wp:extent cx="1771650" cy="997516"/>
+          <wp:effectExtent l="0" t="0" r="0" b="0"/>
+          <wp:docPr id="700316397" name="Picture 1"/>
+          <wp:cNvGraphicFramePr>
+            <a:graphicFrameLocks xmlns:a="http://schemas.openxmlformats.org/drawingml/2006/main" noChangeAspect="1"/>
+          </wp:cNvGraphicFramePr>
+          <a:graphic xmlns:a="http://schemas.openxmlformats.org/drawingml/2006/main">
+            <a:graphicData uri="http://schemas.openxmlformats.org/drawingml/2006/picture">
+              <pic:pic xmlns:pic="http://schemas.openxmlformats.org/drawingml/2006/picture">
+                <pic:nvPicPr>
+                  <pic:cNvPr id="700316397" name="Picture 700316397"/>
+                  <pic:cNvPicPr/>
+                </pic:nvPicPr>
+                <pic:blipFill>
+                  <a:blip r:embed="rId1">
+                    <a:extLst>
+                      <a:ext uri="{28A0092B-C50C-407E-A947-70E740481C1C}">
+                        <a14:useLocalDpi xmlns:a14="http://schemas.microsoft.com/office/drawing/2010/main" val="0"/>
+                      </a:ext>
+                    </a:extLst>
+                  </a:blip>
+                  <a:stretch>
+                    <a:fillRect/>
+                  </a:stretch>
+                </pic:blipFill>
+                <pic:spPr>
+                  <a:xfrm>
+                    <a:off x="0" y="0"/>
+                    <a:ext cx="1876247" cy="1056408"/>
+                  </a:xfrm>
+                  <a:prstGeom prst="rect">
+                    <a:avLst/>
+                  </a:prstGeom>
+                </pic:spPr>
+              </pic:pic>
+            </a:graphicData>
+          </a:graphic>
+        </wp:inline>
+      </w:drawing>
+    </w:r>
+    <w:r>
+      <w:rPr>
+        <w:noProof/>
+      </w:rPr>
+      <w:pict w14:anchorId="0C7EDFD0">
         <v:shapetype id="_x0000_t75" coordsize="21600,21600" o:spt="75" o:preferrelative="t" path="m@4@5l@4@11@9@11@9@5xe" filled="f" stroked="f">
           <v:stroke joinstyle="miter"/>
           <v:formulas>
@@ -229,56 +215,11 @@
           <v:path o:extrusionok="f" gradientshapeok="t" o:connecttype="rect"/>
           <o:lock v:ext="edit" aspectratio="t"/>
         </v:shapetype>
-        <v:shape id="WordPictureWatermark1375570290" o:spid="_x0000_s1026" type="#_x0000_t75" alt="" style="position:absolute;left:0;text-align:left;margin-left:0;margin-top:0;width:469pt;height:263pt;z-index:-251637760;mso-wrap-edited:f;mso-width-percent:0;mso-height-percent:0;mso-position-horizontal:center;mso-position-horizontal-relative:margin;mso-position-vertical:center;mso-position-vertical-relative:margin;mso-width-percent:0;mso-height-percent:0" o:allowincell="f">
-          <v:imagedata r:id="rId1" o:title="Picture1" gain="19661f" blacklevel="22938f"/>
+        <v:shape id="WordPictureWatermark1062352012" o:spid="_x0000_s1026" type="#_x0000_t75" alt="" style="position:absolute;left:0;text-align:left;margin-left:0;margin-top:0;width:467.8pt;height:263.15pt;z-index:-251650048;mso-wrap-edited:f;mso-width-percent:0;mso-height-percent:0;mso-position-horizontal:center;mso-position-horizontal-relative:margin;mso-position-vertical:center;mso-position-vertical-relative:margin;mso-width-percent:0;mso-height-percent:0" o:allowincell="f">
+          <v:imagedata r:id="rId2" o:title="logo-dark" gain="19661f" blacklevel="22938f"/>
+          <w10:wrap anchorx="margin" anchory="margin"/>
         </v:shape>
       </w:pict>
-    </w:r>
-    <w:r>
-      <w:rPr>
-        <w:noProof/>
-      </w:rPr>
-      <w:drawing>
-        <wp:inline distT="0" distB="0" distL="0" distR="0" wp14:anchorId="5D503695" wp14:editId="71AD4AB3">
-          <wp:extent cx="1429789" cy="804256"/>
-          <wp:effectExtent l="0" t="0" r="0" b="0"/>
-          <wp:docPr id="1618636361" name="Graphic 2"/>
-          <wp:cNvGraphicFramePr>
-            <a:graphicFrameLocks xmlns:a="http://schemas.openxmlformats.org/drawingml/2006/main" noChangeAspect="1"/>
-          </wp:cNvGraphicFramePr>
-          <a:graphic xmlns:a="http://schemas.openxmlformats.org/drawingml/2006/main">
-            <a:graphicData uri="http://schemas.openxmlformats.org/drawingml/2006/picture">
-              <pic:pic xmlns:pic="http://schemas.openxmlformats.org/drawingml/2006/picture">
-                <pic:nvPicPr>
-                  <pic:cNvPr id="1618636361" name="Graphic 1618636361"/>
-                  <pic:cNvPicPr/>
-                </pic:nvPicPr>
-                <pic:blipFill>
-                  <a:blip r:embed="rId2">
-                    <a:extLst>
-                      <a:ext uri="{96DAC541-7B7A-43D3-8B79-37D633B846F1}">
-                        <asvg:svgBlip xmlns:asvg="http://schemas.microsoft.com/office/drawing/2016/SVG/main" r:embed="rId3"/>
-                      </a:ext>
-                    </a:extLst>
-                  </a:blip>
-                  <a:stretch>
-                    <a:fillRect/>
-                  </a:stretch>
-                </pic:blipFill>
-                <pic:spPr>
-                  <a:xfrm>
-                    <a:off x="0" y="0"/>
-                    <a:ext cx="1450648" cy="815989"/>
-                  </a:xfrm>
-                  <a:prstGeom prst="rect">
-                    <a:avLst/>
-                  </a:prstGeom>
-                </pic:spPr>
-              </pic:pic>
-            </a:graphicData>
-          </a:graphic>
-        </wp:inline>
-      </w:drawing>
     </w:r>
   </w:p>
 </w:hdr>
@@ -294,7 +235,7 @@
       <w:rPr>
         <w:noProof/>
       </w:rPr>
-      <w:pict w14:anchorId="3F378FAC">
+      <w:pict w14:anchorId="712DEEBD">
         <v:shapetype id="_x0000_t75" coordsize="21600,21600" o:spt="75" o:preferrelative="t" path="m@4@5l@4@11@9@11@9@5xe" filled="f" stroked="f">
           <v:stroke joinstyle="miter"/>
           <v:formulas>
@@ -314,8 +255,9 @@
           <v:path o:extrusionok="f" gradientshapeok="t" o:connecttype="rect"/>
           <o:lock v:ext="edit" aspectratio="t"/>
         </v:shapetype>
-        <v:shape id="WordPictureWatermark1375570288" o:spid="_x0000_s1025" type="#_x0000_t75" alt="" style="position:absolute;margin-left:0;margin-top:0;width:469pt;height:263pt;z-index:-251641856;mso-wrap-edited:f;mso-width-percent:0;mso-height-percent:0;mso-position-horizontal:center;mso-position-horizontal-relative:margin;mso-position-vertical:center;mso-position-vertical-relative:margin;mso-width-percent:0;mso-height-percent:0" o:allowincell="f">
-          <v:imagedata r:id="rId1" o:title="Picture1" gain="19661f" blacklevel="22938f"/>
+        <v:shape id="WordPictureWatermark1062352010" o:spid="_x0000_s1025" type="#_x0000_t75" alt="" style="position:absolute;margin-left:0;margin-top:0;width:467.8pt;height:263.15pt;z-index:-251656192;mso-wrap-edited:f;mso-width-percent:0;mso-height-percent:0;mso-position-horizontal:center;mso-position-horizontal-relative:margin;mso-position-vertical:center;mso-position-vertical-relative:margin;mso-width-percent:0;mso-height-percent:0" o:allowincell="f">
+          <v:imagedata r:id="rId1" o:title="logo-dark" gain="19661f" blacklevel="22938f"/>
+          <w10:wrap anchorx="margin" anchory="margin"/>
         </v:shape>
       </w:pict>
     </w:r>

</xml_diff>